<commit_message>
Build-13.03.25V1 Temporary Pixel UI improve
</commit_message>
<xml_diff>
--- a/Process Documents/Used resources.docx
+++ b/Process Documents/Used resources.docx
@@ -12,7 +12,9 @@
           <w:szCs w:val="22"/>
         </w:rPr>
       </w:pPr>
-      <w:r>
+    </w:p>
+    <w:p>
+      <w:pPr>
         <w:rPr>
           <w:rFonts w:ascii="Arial" w:hAnsi="Arial" w:cs="Arial"/>
           <w:b/>
@@ -20,6 +22,15 @@
           <w:sz w:val="22"/>
           <w:szCs w:val="22"/>
         </w:rPr>
+      </w:pPr>
+      <w:r>
+        <w:rPr>
+          <w:rFonts w:ascii="Arial" w:hAnsi="Arial" w:cs="Arial"/>
+          <w:b/>
+          <w:bCs/>
+          <w:sz w:val="22"/>
+          <w:szCs w:val="22"/>
+        </w:rPr>
         <w:t>Used Resources</w:t>
       </w:r>
     </w:p>
@@ -43,7 +54,7 @@
     <w:p>
       <w:pPr>
         <w:rPr>
-          <w:rFonts w:ascii="Arial" w:hAnsi="Arial" w:cs="Arial" w:hint="eastAsia"/>
+          <w:rFonts w:ascii="Arial" w:hAnsi="Arial" w:cs="Arial"/>
           <w:sz w:val="22"/>
           <w:szCs w:val="22"/>
         </w:rPr>
@@ -109,7 +120,7 @@
           <w:szCs w:val="22"/>
         </w:rPr>
       </w:pPr>
-      <w:hyperlink r:id="rId5" w:history="1">
+      <w:hyperlink r:id="rId7" w:history="1">
         <w:r>
           <w:rPr>
             <w:rStyle w:val="ae"/>
@@ -133,7 +144,7 @@
           <w:szCs w:val="22"/>
         </w:rPr>
       </w:pPr>
-      <w:hyperlink r:id="rId6" w:history="1">
+      <w:hyperlink r:id="rId8" w:history="1">
         <w:r>
           <w:rPr>
             <w:rStyle w:val="ae"/>
@@ -157,7 +168,7 @@
           <w:szCs w:val="22"/>
         </w:rPr>
       </w:pPr>
-      <w:hyperlink r:id="rId7" w:history="1">
+      <w:hyperlink r:id="rId9" w:history="1">
         <w:r>
           <w:rPr>
             <w:rStyle w:val="ae"/>
@@ -181,7 +192,7 @@
           <w:szCs w:val="22"/>
         </w:rPr>
       </w:pPr>
-      <w:hyperlink r:id="rId8" w:history="1">
+      <w:hyperlink r:id="rId10" w:history="1">
         <w:r>
           <w:rPr>
             <w:rStyle w:val="ae"/>
@@ -213,7 +224,7 @@
           <w:szCs w:val="22"/>
         </w:rPr>
       </w:pPr>
-      <w:hyperlink r:id="rId9" w:history="1">
+      <w:hyperlink r:id="rId11" w:history="1">
         <w:r>
           <w:rPr>
             <w:rStyle w:val="ae"/>
@@ -239,7 +250,7 @@
           <w:szCs w:val="22"/>
         </w:rPr>
       </w:pPr>
-      <w:hyperlink r:id="rId10" w:tgtFrame="_new" w:history="1">
+      <w:hyperlink r:id="rId12" w:tgtFrame="_new" w:history="1">
         <w:r>
           <w:rPr>
             <w:rStyle w:val="ae"/>
@@ -253,6 +264,55 @@
     </w:p>
     <w:p>
       <w:pPr>
+        <w:widowControl/>
+        <w:numPr>
+          <w:ilvl w:val="0"/>
+          <w:numId w:val="1"/>
+        </w:numPr>
+        <w:spacing w:before="100" w:beforeAutospacing="1" w:after="100" w:afterAutospacing="1" w:line="240" w:lineRule="auto"/>
+        <w:rPr>
+          <w:rFonts w:ascii="Arial" w:hAnsi="Arial" w:cs="Arial"/>
+          <w:sz w:val="22"/>
+          <w:szCs w:val="22"/>
+        </w:rPr>
+      </w:pPr>
+      <w:hyperlink r:id="rId13" w:history="1">
+        <w:r>
+          <w:rPr>
+            <w:rStyle w:val="ae"/>
+            <w:rFonts w:ascii="Arial" w:hAnsi="Arial" w:cs="Arial"/>
+            <w:sz w:val="22"/>
+            <w:szCs w:val="22"/>
+          </w:rPr>
+          <w:t>https://www.naukri.com/code360/library/window-in-pygame</w:t>
+        </w:r>
+      </w:hyperlink>
+    </w:p>
+    <w:p>
+      <w:pPr>
+        <w:widowControl/>
+        <w:numPr>
+          <w:ilvl w:val="0"/>
+          <w:numId w:val="1"/>
+        </w:numPr>
+        <w:spacing w:before="100" w:beforeAutospacing="1" w:after="100" w:afterAutospacing="1" w:line="240" w:lineRule="auto"/>
+        <w:rPr>
+          <w:rFonts w:ascii="Arial" w:hAnsi="Arial" w:cs="Arial"/>
+          <w:sz w:val="22"/>
+          <w:szCs w:val="22"/>
+        </w:rPr>
+      </w:pPr>
+      <w:r>
+        <w:rPr>
+          <w:rFonts w:ascii="Arial" w:hAnsi="Arial" w:cs="Arial"/>
+          <w:sz w:val="22"/>
+          <w:szCs w:val="22"/>
+        </w:rPr>
+        <w:t>https://www.1001fonts.com/ticketing-font.html</w:t>
+      </w:r>
+    </w:p>
+    <w:p>
+      <w:pPr>
         <w:pStyle w:val="3"/>
         <w:rPr>
           <w:rFonts w:ascii="Arial" w:hAnsi="Arial" w:cs="Arial"/>
@@ -285,7 +345,7 @@
           <w:szCs w:val="22"/>
         </w:rPr>
       </w:pPr>
-      <w:hyperlink r:id="rId11" w:tgtFrame="_new" w:history="1">
+      <w:hyperlink r:id="rId14" w:tgtFrame="_new" w:history="1">
         <w:r>
           <w:rPr>
             <w:rStyle w:val="ae"/>
@@ -309,7 +369,7 @@
           <w:szCs w:val="22"/>
         </w:rPr>
       </w:pPr>
-      <w:hyperlink r:id="rId12" w:tgtFrame="_new" w:history="1">
+      <w:hyperlink r:id="rId15" w:tgtFrame="_new" w:history="1">
         <w:r>
           <w:rPr>
             <w:rStyle w:val="ae"/>
@@ -333,7 +393,7 @@
           <w:szCs w:val="22"/>
         </w:rPr>
       </w:pPr>
-      <w:hyperlink r:id="rId13" w:tgtFrame="_new" w:history="1">
+      <w:hyperlink r:id="rId16" w:tgtFrame="_new" w:history="1">
         <w:r>
           <w:rPr>
             <w:rStyle w:val="ae"/>
@@ -355,7 +415,6 @@
           <w:szCs w:val="22"/>
         </w:rPr>
       </w:pPr>
-      <w:proofErr w:type="spellStart"/>
       <w:r>
         <w:rPr>
           <w:rFonts w:ascii="Arial" w:hAnsi="Arial" w:cs="Arial"/>
@@ -364,18 +423,7 @@
           <w:sz w:val="22"/>
           <w:szCs w:val="22"/>
         </w:rPr>
-        <w:t>Pygame</w:t>
-      </w:r>
-      <w:proofErr w:type="spellEnd"/>
-      <w:r>
-        <w:rPr>
-          <w:rFonts w:ascii="Arial" w:hAnsi="Arial" w:cs="Arial"/>
-          <w:b/>
-          <w:bCs/>
-          <w:sz w:val="22"/>
-          <w:szCs w:val="22"/>
-        </w:rPr>
-        <w:t xml:space="preserve"> Lag Problem Fix</w:t>
+        <w:t>Pygame Lag Problem Fix</w:t>
       </w:r>
     </w:p>
     <w:p>
@@ -390,7 +438,7 @@
           <w:szCs w:val="22"/>
         </w:rPr>
       </w:pPr>
-      <w:hyperlink r:id="rId14" w:history="1">
+      <w:hyperlink r:id="rId17" w:history="1">
         <w:r>
           <w:rPr>
             <w:rStyle w:val="ae"/>
@@ -398,25 +446,7 @@
             <w:sz w:val="22"/>
             <w:szCs w:val="22"/>
           </w:rPr>
-          <w:t>Nuitka Compiling wit</w:t>
-        </w:r>
-        <w:r>
-          <w:rPr>
-            <w:rStyle w:val="ae"/>
-            <w:rFonts w:ascii="Arial" w:hAnsi="Arial" w:cs="Arial"/>
-            <w:sz w:val="22"/>
-            <w:szCs w:val="22"/>
-          </w:rPr>
-          <w:t>h</w:t>
-        </w:r>
-        <w:r>
-          <w:rPr>
-            <w:rStyle w:val="ae"/>
-            <w:rFonts w:ascii="Arial" w:hAnsi="Arial" w:cs="Arial"/>
-            <w:sz w:val="22"/>
-            <w:szCs w:val="22"/>
-          </w:rPr>
-          <w:t xml:space="preserve"> MinGW64 on Linux</w:t>
+          <w:t>Nuitka Compiling with MinGW64 on Linux</w:t>
         </w:r>
       </w:hyperlink>
       <w:r>
@@ -440,7 +470,7 @@
           <w:szCs w:val="22"/>
         </w:rPr>
       </w:pPr>
-      <w:hyperlink r:id="rId15" w:history="1">
+      <w:hyperlink r:id="rId18" w:history="1">
         <w:r>
           <w:rPr>
             <w:rStyle w:val="ae"/>
@@ -464,7 +494,7 @@
           <w:szCs w:val="22"/>
         </w:rPr>
       </w:pPr>
-      <w:hyperlink r:id="rId16" w:history="1">
+      <w:hyperlink r:id="rId19" w:history="1">
         <w:r>
           <w:rPr>
             <w:rStyle w:val="ae"/>
@@ -488,7 +518,7 @@
           <w:szCs w:val="22"/>
         </w:rPr>
       </w:pPr>
-      <w:hyperlink r:id="rId17" w:history="1">
+      <w:hyperlink r:id="rId20" w:history="1">
         <w:r>
           <w:rPr>
             <w:rStyle w:val="ae"/>
@@ -541,7 +571,7 @@
           <w:szCs w:val="22"/>
         </w:rPr>
       </w:pPr>
-      <w:hyperlink r:id="rId18" w:history="1">
+      <w:hyperlink r:id="rId21" w:history="1">
         <w:r>
           <w:rPr>
             <w:rStyle w:val="ae"/>
@@ -565,7 +595,7 @@
           <w:szCs w:val="22"/>
         </w:rPr>
       </w:pPr>
-      <w:hyperlink r:id="rId19" w:history="1">
+      <w:hyperlink r:id="rId22" w:history="1">
         <w:r>
           <w:rPr>
             <w:rStyle w:val="ae"/>
@@ -589,7 +619,7 @@
           <w:szCs w:val="22"/>
         </w:rPr>
       </w:pPr>
-      <w:hyperlink r:id="rId20" w:history="1">
+      <w:hyperlink r:id="rId23" w:history="1">
         <w:r>
           <w:rPr>
             <w:rStyle w:val="ae"/>
@@ -634,7 +664,7 @@
           <w:szCs w:val="22"/>
         </w:rPr>
       </w:pPr>
-      <w:hyperlink r:id="rId21" w:history="1">
+      <w:hyperlink r:id="rId24" w:history="1">
         <w:r>
           <w:rPr>
             <w:rStyle w:val="ae"/>
@@ -658,7 +688,7 @@
           <w:szCs w:val="22"/>
         </w:rPr>
       </w:pPr>
-      <w:hyperlink r:id="rId22" w:history="1">
+      <w:hyperlink r:id="rId25" w:history="1">
         <w:r>
           <w:rPr>
             <w:rStyle w:val="ae"/>
@@ -682,7 +712,7 @@
           <w:szCs w:val="22"/>
         </w:rPr>
       </w:pPr>
-      <w:hyperlink r:id="rId23" w:history="1">
+      <w:hyperlink r:id="rId26" w:history="1">
         <w:r>
           <w:rPr>
             <w:rStyle w:val="ae"/>
@@ -706,7 +736,7 @@
           <w:szCs w:val="22"/>
         </w:rPr>
       </w:pPr>
-      <w:hyperlink r:id="rId24" w:history="1">
+      <w:hyperlink r:id="rId27" w:history="1">
         <w:r>
           <w:rPr>
             <w:rStyle w:val="ae"/>
@@ -730,7 +760,7 @@
           <w:szCs w:val="22"/>
         </w:rPr>
       </w:pPr>
-      <w:hyperlink r:id="rId25" w:history="1">
+      <w:hyperlink r:id="rId28" w:history="1">
         <w:r>
           <w:rPr>
             <w:rStyle w:val="ae"/>
@@ -754,7 +784,7 @@
           <w:szCs w:val="22"/>
         </w:rPr>
       </w:pPr>
-      <w:hyperlink r:id="rId26" w:history="1">
+      <w:hyperlink r:id="rId29" w:history="1">
         <w:r>
           <w:rPr>
             <w:rStyle w:val="ae"/>
@@ -778,7 +808,7 @@
           <w:szCs w:val="22"/>
         </w:rPr>
       </w:pPr>
-      <w:hyperlink r:id="rId27" w:history="1">
+      <w:hyperlink r:id="rId30" w:history="1">
         <w:r>
           <w:rPr>
             <w:rStyle w:val="ae"/>
@@ -823,7 +853,7 @@
           <w:szCs w:val="22"/>
         </w:rPr>
       </w:pPr>
-      <w:hyperlink r:id="rId28" w:history="1">
+      <w:hyperlink r:id="rId31" w:history="1">
         <w:r>
           <w:rPr>
             <w:rStyle w:val="ae"/>
@@ -847,7 +877,7 @@
           <w:szCs w:val="22"/>
         </w:rPr>
       </w:pPr>
-      <w:hyperlink r:id="rId29" w:tgtFrame="_new" w:history="1">
+      <w:hyperlink r:id="rId32" w:tgtFrame="_new" w:history="1">
         <w:r>
           <w:rPr>
             <w:rStyle w:val="ae"/>
@@ -871,7 +901,7 @@
           <w:szCs w:val="22"/>
         </w:rPr>
       </w:pPr>
-      <w:hyperlink r:id="rId30" w:tgtFrame="_new" w:history="1">
+      <w:hyperlink r:id="rId33" w:tgtFrame="_new" w:history="1">
         <w:r>
           <w:rPr>
             <w:rStyle w:val="ae"/>
@@ -895,7 +925,7 @@
           <w:szCs w:val="22"/>
         </w:rPr>
       </w:pPr>
-      <w:hyperlink r:id="rId31" w:tgtFrame="_new" w:history="1">
+      <w:hyperlink r:id="rId34" w:tgtFrame="_new" w:history="1">
         <w:r>
           <w:rPr>
             <w:rStyle w:val="ae"/>
@@ -919,7 +949,7 @@
           <w:szCs w:val="22"/>
         </w:rPr>
       </w:pPr>
-      <w:hyperlink r:id="rId32" w:tgtFrame="_new" w:history="1">
+      <w:hyperlink r:id="rId35" w:tgtFrame="_new" w:history="1">
         <w:r>
           <w:rPr>
             <w:rStyle w:val="ae"/>
@@ -964,7 +994,7 @@
           <w:szCs w:val="22"/>
         </w:rPr>
       </w:pPr>
-      <w:hyperlink r:id="rId33" w:history="1">
+      <w:hyperlink r:id="rId36" w:history="1">
         <w:r>
           <w:rPr>
             <w:rStyle w:val="ae"/>
@@ -990,7 +1020,7 @@
           <w:szCs w:val="22"/>
         </w:rPr>
       </w:pPr>
-      <w:hyperlink r:id="rId34" w:tgtFrame="_new" w:history="1">
+      <w:hyperlink r:id="rId37" w:tgtFrame="_new" w:history="1">
         <w:r>
           <w:rPr>
             <w:rStyle w:val="ae"/>
@@ -1035,7 +1065,7 @@
           <w:szCs w:val="22"/>
         </w:rPr>
       </w:pPr>
-      <w:hyperlink r:id="rId35" w:history="1">
+      <w:hyperlink r:id="rId38" w:history="1">
         <w:r>
           <w:rPr>
             <w:rStyle w:val="ae"/>
@@ -1088,7 +1118,7 @@
           <w:szCs w:val="22"/>
         </w:rPr>
       </w:pPr>
-      <w:hyperlink r:id="rId36" w:history="1">
+      <w:hyperlink r:id="rId39" w:history="1">
         <w:r>
           <w:rPr>
             <w:rStyle w:val="ae"/>
@@ -1112,7 +1142,7 @@
           <w:szCs w:val="22"/>
         </w:rPr>
       </w:pPr>
-      <w:hyperlink r:id="rId37" w:history="1">
+      <w:hyperlink r:id="rId40" w:history="1">
         <w:r>
           <w:rPr>
             <w:rStyle w:val="ae"/>
@@ -1139,7 +1169,7 @@
           <w:szCs w:val="22"/>
         </w:rPr>
         <w:pict w14:anchorId="74E1AADF">
-          <v:rect id="_x0000_i1047" style="width:0;height:1.5pt" o:hralign="center" o:hrstd="t" o:hr="t" fillcolor="#a0a0a0" stroked="f"/>
+          <v:rect id="_x0000_i1025" style="width:0;height:1.5pt" o:hralign="center" o:hrstd="t" o:hr="t" fillcolor="#a0a0a0" stroked="f"/>
         </w:pict>
       </w:r>
     </w:p>
@@ -1161,7 +1191,6 @@
           <w:sz w:val="22"/>
           <w:szCs w:val="22"/>
         </w:rPr>
-        <w:lastRenderedPageBreak/>
         <w:t>Resources URL</w:t>
       </w:r>
     </w:p>
@@ -1177,7 +1206,7 @@
           <w:szCs w:val="22"/>
         </w:rPr>
       </w:pPr>
-      <w:hyperlink r:id="rId38" w:history="1">
+      <w:hyperlink r:id="rId41" w:history="1">
         <w:r>
           <w:rPr>
             <w:rStyle w:val="ae"/>
@@ -1201,7 +1230,7 @@
           <w:szCs w:val="22"/>
         </w:rPr>
       </w:pPr>
-      <w:hyperlink r:id="rId39" w:anchor="goog_game_inter" w:history="1">
+      <w:hyperlink r:id="rId42" w:anchor="goog_game_inter" w:history="1">
         <w:r>
           <w:rPr>
             <w:rStyle w:val="ae"/>
@@ -1233,7 +1262,7 @@
           <w:szCs w:val="22"/>
         </w:rPr>
       </w:pPr>
-      <w:hyperlink r:id="rId40" w:history="1">
+      <w:hyperlink r:id="rId43" w:history="1">
         <w:r>
           <w:rPr>
             <w:rStyle w:val="ae"/>
@@ -1252,7 +1281,7 @@
         </w:rPr>
         <w:t xml:space="preserve"> - A fully functional Monopoly game in JavaScript, open-source on </w:t>
       </w:r>
-      <w:hyperlink r:id="rId41" w:history="1">
+      <w:hyperlink r:id="rId44" w:history="1">
         <w:r>
           <w:rPr>
             <w:rStyle w:val="ae"/>
@@ -1284,7 +1313,7 @@
           <w:szCs w:val="22"/>
         </w:rPr>
       </w:pPr>
-      <w:hyperlink r:id="rId42" w:history="1">
+      <w:hyperlink r:id="rId45" w:history="1">
         <w:r>
           <w:rPr>
             <w:rStyle w:val="ae"/>
@@ -1301,43 +1330,7 @@
           <w:sz w:val="22"/>
           <w:szCs w:val="22"/>
         </w:rPr>
-        <w:t xml:space="preserve"> - A Monopoly game made with Python using </w:t>
-      </w:r>
-      <w:proofErr w:type="spellStart"/>
-      <w:r>
-        <w:rPr>
-          <w:rFonts w:ascii="Arial" w:hAnsi="Arial" w:cs="Arial"/>
-          <w:sz w:val="22"/>
-          <w:szCs w:val="22"/>
-        </w:rPr>
-        <w:t>Pygame</w:t>
-      </w:r>
-      <w:proofErr w:type="spellEnd"/>
-      <w:r>
-        <w:rPr>
-          <w:rFonts w:ascii="Arial" w:hAnsi="Arial" w:cs="Arial"/>
-          <w:sz w:val="22"/>
-          <w:szCs w:val="22"/>
-        </w:rPr>
-        <w:t xml:space="preserve"> and </w:t>
-      </w:r>
-      <w:proofErr w:type="spellStart"/>
-      <w:r>
-        <w:rPr>
-          <w:rFonts w:ascii="Arial" w:hAnsi="Arial" w:cs="Arial"/>
-          <w:sz w:val="22"/>
-          <w:szCs w:val="22"/>
-        </w:rPr>
-        <w:t>Tkinter</w:t>
-      </w:r>
-      <w:proofErr w:type="spellEnd"/>
-      <w:r>
-        <w:rPr>
-          <w:rFonts w:ascii="Arial" w:hAnsi="Arial" w:cs="Arial"/>
-          <w:sz w:val="22"/>
-          <w:szCs w:val="22"/>
-        </w:rPr>
-        <w:t>.</w:t>
+        <w:t xml:space="preserve"> - A Monopoly game made with Python using Pygame and Tkinter.</w:t>
       </w:r>
     </w:p>
     <w:p>
@@ -1352,7 +1345,7 @@
           <w:szCs w:val="22"/>
         </w:rPr>
       </w:pPr>
-      <w:hyperlink r:id="rId43" w:history="1">
+      <w:hyperlink r:id="rId46" w:history="1">
         <w:r>
           <w:rPr>
             <w:rStyle w:val="ae"/>
@@ -1369,31 +1362,13 @@
           <w:sz w:val="22"/>
           <w:szCs w:val="22"/>
         </w:rPr>
-        <w:t xml:space="preserve"> - A video example of Monopoly using </w:t>
+        <w:t xml:space="preserve"> - A video example of Monopoly using Pygame.</w:t>
       </w:r>
-      <w:proofErr w:type="spellStart"/>
-      <w:r>
-        <w:rPr>
-          <w:rFonts w:ascii="Arial" w:hAnsi="Arial" w:cs="Arial"/>
-          <w:sz w:val="22"/>
-          <w:szCs w:val="22"/>
-        </w:rPr>
-        <w:t>Pygame</w:t>
-      </w:r>
-      <w:proofErr w:type="spellEnd"/>
-      <w:r>
-        <w:rPr>
-          <w:rFonts w:ascii="Arial" w:hAnsi="Arial" w:cs="Arial"/>
-          <w:sz w:val="22"/>
-          <w:szCs w:val="22"/>
-        </w:rPr>
-        <w:t>.</w:t>
-      </w:r>
-    </w:p>
-    <w:p>
-      <w:pPr>
-        <w:rPr>
-          <w:rFonts w:ascii="Arial" w:hAnsi="Arial" w:cs="Arial" w:hint="eastAsia"/>
+    </w:p>
+    <w:p>
+      <w:pPr>
+        <w:rPr>
+          <w:rFonts w:ascii="Arial" w:hAnsi="Arial" w:cs="Arial"/>
           <w:sz w:val="22"/>
           <w:szCs w:val="22"/>
         </w:rPr>
@@ -1407,6 +1382,56 @@
     </w:sectPr>
   </w:body>
 </w:document>
+</file>
+
+<file path=word/endnotes.xml><?xml version="1.0" encoding="utf-8"?>
+<w:endnotes xmlns:wpc="http://schemas.microsoft.com/office/word/2010/wordprocessingCanvas" xmlns:cx="http://schemas.microsoft.com/office/drawing/2014/chartex" xmlns:cx1="http://schemas.microsoft.com/office/drawing/2015/9/8/chartex" xmlns:cx2="http://schemas.microsoft.com/office/drawing/2015/10/21/chartex" xmlns:cx3="http://schemas.microsoft.com/office/drawing/2016/5/9/chartex" xmlns:cx4="http://schemas.microsoft.com/office/drawing/2016/5/10/chartex" xmlns:cx5="http://schemas.microsoft.com/office/drawing/2016/5/11/chartex" xmlns:cx6="http://schemas.microsoft.com/office/drawing/2016/5/12/chartex" xmlns:cx7="http://schemas.microsoft.com/office/drawing/2016/5/13/chartex" xmlns:cx8="http://schemas.microsoft.com/office/drawing/2016/5/14/chartex" xmlns:mc="http://schemas.openxmlformats.org/markup-compatibility/2006" xmlns:aink="http://schemas.microsoft.com/office/drawing/2016/ink" xmlns:am3d="http://schemas.microsoft.com/office/drawing/2017/model3d" xmlns:o="urn:schemas-microsoft-com:office:office" xmlns:oel="http://schemas.microsoft.com/office/2019/extlst" xmlns:r="http://schemas.openxmlformats.org/officeDocument/2006/relationships" xmlns:m="http://schemas.openxmlformats.org/officeDocument/2006/math" xmlns:v="urn:schemas-microsoft-com:vml" xmlns:wp14="http://schemas.microsoft.com/office/word/2010/wordprocessingDrawing" xmlns:wp="http://schemas.openxmlformats.org/drawingml/2006/wordprocessingDrawing" xmlns:w10="urn:schemas-microsoft-com:office:word" xmlns:w="http://schemas.openxmlformats.org/wordprocessingml/2006/main" xmlns:w14="http://schemas.microsoft.com/office/word/2010/wordml" xmlns:w15="http://schemas.microsoft.com/office/word/2012/wordml" xmlns:w16cex="http://schemas.microsoft.com/office/word/2018/wordml/cex" xmlns:w16cid="http://schemas.microsoft.com/office/word/2016/wordml/cid" xmlns:w16="http://schemas.microsoft.com/office/word/2018/wordml" xmlns:w16du="http://schemas.microsoft.com/office/word/2023/wordml/word16du" xmlns:w16sdtdh="http://schemas.microsoft.com/office/word/2020/wordml/sdtdatahash" xmlns:w16sdtfl="http://schemas.microsoft.com/office/word/2024/wordml/sdtformatlock" xmlns:w16se="http://schemas.microsoft.com/office/word/2015/wordml/symex" xmlns:wpg="http://schemas.microsoft.com/office/word/2010/wordprocessingGroup" xmlns:wpi="http://schemas.microsoft.com/office/word/2010/wordprocessingInk" xmlns:wne="http://schemas.microsoft.com/office/word/2006/wordml" xmlns:wps="http://schemas.microsoft.com/office/word/2010/wordprocessingShape" mc:Ignorable="w14 w15 w16se w16cid w16 w16cex w16sdtdh w16sdtfl w16du wp14">
+  <w:endnote w:type="separator" w:id="-1">
+    <w:p>
+      <w:pPr>
+        <w:spacing w:after="0" w:line="240" w:lineRule="auto"/>
+      </w:pPr>
+      <w:r>
+        <w:separator/>
+      </w:r>
+    </w:p>
+  </w:endnote>
+  <w:endnote w:type="continuationSeparator" w:id="0">
+    <w:p>
+      <w:pPr>
+        <w:spacing w:after="0" w:line="240" w:lineRule="auto"/>
+      </w:pPr>
+      <w:r>
+        <w:continuationSeparator/>
+      </w:r>
+    </w:p>
+  </w:endnote>
+</w:endnotes>
+</file>
+
+<file path=word/footnotes.xml><?xml version="1.0" encoding="utf-8"?>
+<w:footnotes xmlns:wpc="http://schemas.microsoft.com/office/word/2010/wordprocessingCanvas" xmlns:cx="http://schemas.microsoft.com/office/drawing/2014/chartex" xmlns:cx1="http://schemas.microsoft.com/office/drawing/2015/9/8/chartex" xmlns:cx2="http://schemas.microsoft.com/office/drawing/2015/10/21/chartex" xmlns:cx3="http://schemas.microsoft.com/office/drawing/2016/5/9/chartex" xmlns:cx4="http://schemas.microsoft.com/office/drawing/2016/5/10/chartex" xmlns:cx5="http://schemas.microsoft.com/office/drawing/2016/5/11/chartex" xmlns:cx6="http://schemas.microsoft.com/office/drawing/2016/5/12/chartex" xmlns:cx7="http://schemas.microsoft.com/office/drawing/2016/5/13/chartex" xmlns:cx8="http://schemas.microsoft.com/office/drawing/2016/5/14/chartex" xmlns:mc="http://schemas.openxmlformats.org/markup-compatibility/2006" xmlns:aink="http://schemas.microsoft.com/office/drawing/2016/ink" xmlns:am3d="http://schemas.microsoft.com/office/drawing/2017/model3d" xmlns:o="urn:schemas-microsoft-com:office:office" xmlns:oel="http://schemas.microsoft.com/office/2019/extlst" xmlns:r="http://schemas.openxmlformats.org/officeDocument/2006/relationships" xmlns:m="http://schemas.openxmlformats.org/officeDocument/2006/math" xmlns:v="urn:schemas-microsoft-com:vml" xmlns:wp14="http://schemas.microsoft.com/office/word/2010/wordprocessingDrawing" xmlns:wp="http://schemas.openxmlformats.org/drawingml/2006/wordprocessingDrawing" xmlns:w10="urn:schemas-microsoft-com:office:word" xmlns:w="http://schemas.openxmlformats.org/wordprocessingml/2006/main" xmlns:w14="http://schemas.microsoft.com/office/word/2010/wordml" xmlns:w15="http://schemas.microsoft.com/office/word/2012/wordml" xmlns:w16cex="http://schemas.microsoft.com/office/word/2018/wordml/cex" xmlns:w16cid="http://schemas.microsoft.com/office/word/2016/wordml/cid" xmlns:w16="http://schemas.microsoft.com/office/word/2018/wordml" xmlns:w16du="http://schemas.microsoft.com/office/word/2023/wordml/word16du" xmlns:w16sdtdh="http://schemas.microsoft.com/office/word/2020/wordml/sdtdatahash" xmlns:w16sdtfl="http://schemas.microsoft.com/office/word/2024/wordml/sdtformatlock" xmlns:w16se="http://schemas.microsoft.com/office/word/2015/wordml/symex" xmlns:wpg="http://schemas.microsoft.com/office/word/2010/wordprocessingGroup" xmlns:wpi="http://schemas.microsoft.com/office/word/2010/wordprocessingInk" xmlns:wne="http://schemas.microsoft.com/office/word/2006/wordml" xmlns:wps="http://schemas.microsoft.com/office/word/2010/wordprocessingShape" mc:Ignorable="w14 w15 w16se w16cid w16 w16cex w16sdtdh w16sdtfl w16du wp14">
+  <w:footnote w:type="separator" w:id="-1">
+    <w:p>
+      <w:pPr>
+        <w:spacing w:after="0" w:line="240" w:lineRule="auto"/>
+      </w:pPr>
+      <w:r>
+        <w:separator/>
+      </w:r>
+    </w:p>
+  </w:footnote>
+  <w:footnote w:type="continuationSeparator" w:id="0">
+    <w:p>
+      <w:pPr>
+        <w:spacing w:after="0" w:line="240" w:lineRule="auto"/>
+      </w:pPr>
+      <w:r>
+        <w:continuationSeparator/>
+      </w:r>
+    </w:p>
+  </w:footnote>
+</w:footnotes>
 </file>
 
 <file path=word/numbering.xml><?xml version="1.0" encoding="utf-8"?>
@@ -3842,6 +3867,7 @@
   <w:style w:type="character" w:default="1" w:styleId="a0">
     <w:name w:val="Default Paragraph Font"/>
     <w:uiPriority w:val="1"/>
+    <w:semiHidden/>
     <w:unhideWhenUsed/>
   </w:style>
   <w:style w:type="table" w:default="1" w:styleId="a1">
@@ -4197,6 +4223,66 @@
       <w:bCs/>
     </w:rPr>
   </w:style>
+  <w:style w:type="paragraph" w:styleId="af2">
+    <w:name w:val="header"/>
+    <w:basedOn w:val="a"/>
+    <w:link w:val="af3"/>
+    <w:uiPriority w:val="99"/>
+    <w:unhideWhenUsed/>
+    <w:rsid w:val="005D3B91"/>
+    <w:pPr>
+      <w:tabs>
+        <w:tab w:val="center" w:pos="4153"/>
+        <w:tab w:val="right" w:pos="8306"/>
+      </w:tabs>
+      <w:snapToGrid w:val="0"/>
+    </w:pPr>
+    <w:rPr>
+      <w:sz w:val="20"/>
+      <w:szCs w:val="20"/>
+    </w:rPr>
+  </w:style>
+  <w:style w:type="character" w:customStyle="1" w:styleId="af3">
+    <w:name w:val="頁首 字元"/>
+    <w:basedOn w:val="a0"/>
+    <w:link w:val="af2"/>
+    <w:uiPriority w:val="99"/>
+    <w:rsid w:val="005D3B91"/>
+    <w:rPr>
+      <w:sz w:val="20"/>
+      <w:szCs w:val="20"/>
+    </w:rPr>
+  </w:style>
+  <w:style w:type="paragraph" w:styleId="af4">
+    <w:name w:val="footer"/>
+    <w:basedOn w:val="a"/>
+    <w:link w:val="af5"/>
+    <w:uiPriority w:val="99"/>
+    <w:unhideWhenUsed/>
+    <w:rsid w:val="005D3B91"/>
+    <w:pPr>
+      <w:tabs>
+        <w:tab w:val="center" w:pos="4153"/>
+        <w:tab w:val="right" w:pos="8306"/>
+      </w:tabs>
+      <w:snapToGrid w:val="0"/>
+    </w:pPr>
+    <w:rPr>
+      <w:sz w:val="20"/>
+      <w:szCs w:val="20"/>
+    </w:rPr>
+  </w:style>
+  <w:style w:type="character" w:customStyle="1" w:styleId="af5">
+    <w:name w:val="頁尾 字元"/>
+    <w:basedOn w:val="a0"/>
+    <w:link w:val="af4"/>
+    <w:uiPriority w:val="99"/>
+    <w:rsid w:val="005D3B91"/>
+    <w:rPr>
+      <w:sz w:val="20"/>
+      <w:szCs w:val="20"/>
+    </w:rPr>
+  </w:style>
 </w:styles>
 </file>
 

</xml_diff>

<commit_message>
reupload meeting doc due to git not support ":"
reupload meeting doc due to git not support ":"
</commit_message>
<xml_diff>
--- a/Process Documents/Used resources.docx
+++ b/Process Documents/Used resources.docx
@@ -302,13 +302,117 @@
           <w:szCs w:val="22"/>
         </w:rPr>
       </w:pPr>
+      <w:hyperlink r:id="rId14" w:history="1">
+        <w:r>
+          <w:rPr>
+            <w:rStyle w:val="ae"/>
+            <w:rFonts w:ascii="Arial" w:hAnsi="Arial" w:cs="Arial"/>
+            <w:sz w:val="22"/>
+            <w:szCs w:val="22"/>
+          </w:rPr>
+          <w:t>https://www.1001fonts.com/ticketing-font.html</w:t>
+        </w:r>
+      </w:hyperlink>
+    </w:p>
+    <w:p>
+      <w:pPr>
+        <w:widowControl/>
+        <w:numPr>
+          <w:ilvl w:val="0"/>
+          <w:numId w:val="1"/>
+        </w:numPr>
+        <w:spacing w:before="100" w:beforeAutospacing="1" w:after="100" w:afterAutospacing="1" w:line="240" w:lineRule="auto"/>
+        <w:rPr>
+          <w:rFonts w:ascii="Arial" w:hAnsi="Arial" w:cs="Arial"/>
+          <w:sz w:val="22"/>
+          <w:szCs w:val="22"/>
+        </w:rPr>
+      </w:pPr>
+      <w:hyperlink r:id="rId15" w:history="1">
+        <w:r>
+          <w:rPr>
+            <w:rStyle w:val="ae"/>
+            <w:rFonts w:ascii="Arial" w:hAnsi="Arial" w:cs="Arial"/>
+            <w:sz w:val="22"/>
+            <w:szCs w:val="22"/>
+          </w:rPr>
+          <w:t>https://fonts.google.com/specimen/Libre+Baskerville</w:t>
+        </w:r>
+      </w:hyperlink>
+    </w:p>
+    <w:p>
+      <w:pPr>
+        <w:widowControl/>
+        <w:numPr>
+          <w:ilvl w:val="0"/>
+          <w:numId w:val="1"/>
+        </w:numPr>
+        <w:spacing w:before="100" w:beforeAutospacing="1" w:after="100" w:afterAutospacing="1" w:line="240" w:lineRule="auto"/>
+        <w:rPr>
+          <w:rFonts w:ascii="Arial" w:hAnsi="Arial" w:cs="Arial"/>
+          <w:sz w:val="22"/>
+          <w:szCs w:val="22"/>
+        </w:rPr>
+      </w:pPr>
+      <w:hyperlink r:id="rId16" w:history="1">
+        <w:r>
+          <w:rPr>
+            <w:rStyle w:val="ae"/>
+            <w:rFonts w:ascii="Arial" w:hAnsi="Arial" w:cs="Arial"/>
+            <w:sz w:val="22"/>
+            <w:szCs w:val="22"/>
+          </w:rPr>
+          <w:t>https://www.sussex.ac.uk/brand/designers/fonts</w:t>
+        </w:r>
+      </w:hyperlink>
+    </w:p>
+    <w:p>
+      <w:pPr>
+        <w:widowControl/>
+        <w:numPr>
+          <w:ilvl w:val="0"/>
+          <w:numId w:val="1"/>
+        </w:numPr>
+        <w:spacing w:before="100" w:beforeAutospacing="1" w:after="100" w:afterAutospacing="1" w:line="240" w:lineRule="auto"/>
+        <w:rPr>
+          <w:rFonts w:ascii="Arial" w:hAnsi="Arial" w:cs="Arial"/>
+          <w:sz w:val="22"/>
+          <w:szCs w:val="22"/>
+        </w:rPr>
+      </w:pPr>
+      <w:hyperlink r:id="rId17" w:history="1">
+        <w:r>
+          <w:rPr>
+            <w:rStyle w:val="ae"/>
+            <w:rFonts w:ascii="Arial" w:hAnsi="Arial" w:cs="Arial"/>
+            <w:sz w:val="22"/>
+            <w:szCs w:val="22"/>
+          </w:rPr>
+          <w:t>https://www.strathpefferjunction.com/british-railway-typefaces-fonts/</w:t>
+        </w:r>
+      </w:hyperlink>
+    </w:p>
+    <w:p>
+      <w:pPr>
+        <w:widowControl/>
+        <w:numPr>
+          <w:ilvl w:val="0"/>
+          <w:numId w:val="1"/>
+        </w:numPr>
+        <w:spacing w:before="100" w:beforeAutospacing="1" w:after="100" w:afterAutospacing="1" w:line="240" w:lineRule="auto"/>
+        <w:rPr>
+          <w:rFonts w:ascii="Arial" w:hAnsi="Arial" w:cs="Arial"/>
+          <w:sz w:val="22"/>
+          <w:szCs w:val="22"/>
+        </w:rPr>
+      </w:pPr>
       <w:r>
         <w:rPr>
           <w:rFonts w:ascii="Arial" w:hAnsi="Arial" w:cs="Arial"/>
           <w:sz w:val="22"/>
           <w:szCs w:val="22"/>
         </w:rPr>
-        <w:t>https://www.1001fonts.com/ticketing-font.html</w:t>
+        <w:t>.</w:t>
       </w:r>
     </w:p>
     <w:p>
@@ -345,7 +449,7 @@
           <w:szCs w:val="22"/>
         </w:rPr>
       </w:pPr>
-      <w:hyperlink r:id="rId14" w:tgtFrame="_new" w:history="1">
+      <w:hyperlink r:id="rId18" w:tgtFrame="_new" w:history="1">
         <w:r>
           <w:rPr>
             <w:rStyle w:val="ae"/>
@@ -369,7 +473,7 @@
           <w:szCs w:val="22"/>
         </w:rPr>
       </w:pPr>
-      <w:hyperlink r:id="rId15" w:tgtFrame="_new" w:history="1">
+      <w:hyperlink r:id="rId19" w:tgtFrame="_new" w:history="1">
         <w:r>
           <w:rPr>
             <w:rStyle w:val="ae"/>
@@ -393,7 +497,7 @@
           <w:szCs w:val="22"/>
         </w:rPr>
       </w:pPr>
-      <w:hyperlink r:id="rId16" w:tgtFrame="_new" w:history="1">
+      <w:hyperlink r:id="rId20" w:tgtFrame="_new" w:history="1">
         <w:r>
           <w:rPr>
             <w:rStyle w:val="ae"/>
@@ -438,7 +542,7 @@
           <w:szCs w:val="22"/>
         </w:rPr>
       </w:pPr>
-      <w:hyperlink r:id="rId17" w:history="1">
+      <w:hyperlink r:id="rId21" w:history="1">
         <w:r>
           <w:rPr>
             <w:rStyle w:val="ae"/>
@@ -470,7 +574,7 @@
           <w:szCs w:val="22"/>
         </w:rPr>
       </w:pPr>
-      <w:hyperlink r:id="rId18" w:history="1">
+      <w:hyperlink r:id="rId22" w:history="1">
         <w:r>
           <w:rPr>
             <w:rStyle w:val="ae"/>
@@ -494,7 +598,7 @@
           <w:szCs w:val="22"/>
         </w:rPr>
       </w:pPr>
-      <w:hyperlink r:id="rId19" w:history="1">
+      <w:hyperlink r:id="rId23" w:history="1">
         <w:r>
           <w:rPr>
             <w:rStyle w:val="ae"/>
@@ -518,7 +622,7 @@
           <w:szCs w:val="22"/>
         </w:rPr>
       </w:pPr>
-      <w:hyperlink r:id="rId20" w:history="1">
+      <w:hyperlink r:id="rId24" w:history="1">
         <w:r>
           <w:rPr>
             <w:rStyle w:val="ae"/>
@@ -571,7 +675,7 @@
           <w:szCs w:val="22"/>
         </w:rPr>
       </w:pPr>
-      <w:hyperlink r:id="rId21" w:history="1">
+      <w:hyperlink r:id="rId25" w:history="1">
         <w:r>
           <w:rPr>
             <w:rStyle w:val="ae"/>
@@ -595,7 +699,7 @@
           <w:szCs w:val="22"/>
         </w:rPr>
       </w:pPr>
-      <w:hyperlink r:id="rId22" w:history="1">
+      <w:hyperlink r:id="rId26" w:history="1">
         <w:r>
           <w:rPr>
             <w:rStyle w:val="ae"/>
@@ -619,7 +723,7 @@
           <w:szCs w:val="22"/>
         </w:rPr>
       </w:pPr>
-      <w:hyperlink r:id="rId23" w:history="1">
+      <w:hyperlink r:id="rId27" w:history="1">
         <w:r>
           <w:rPr>
             <w:rStyle w:val="ae"/>
@@ -664,7 +768,7 @@
           <w:szCs w:val="22"/>
         </w:rPr>
       </w:pPr>
-      <w:hyperlink r:id="rId24" w:history="1">
+      <w:hyperlink r:id="rId28" w:history="1">
         <w:r>
           <w:rPr>
             <w:rStyle w:val="ae"/>
@@ -688,7 +792,7 @@
           <w:szCs w:val="22"/>
         </w:rPr>
       </w:pPr>
-      <w:hyperlink r:id="rId25" w:history="1">
+      <w:hyperlink r:id="rId29" w:history="1">
         <w:r>
           <w:rPr>
             <w:rStyle w:val="ae"/>
@@ -712,7 +816,7 @@
           <w:szCs w:val="22"/>
         </w:rPr>
       </w:pPr>
-      <w:hyperlink r:id="rId26" w:history="1">
+      <w:hyperlink r:id="rId30" w:history="1">
         <w:r>
           <w:rPr>
             <w:rStyle w:val="ae"/>
@@ -736,7 +840,7 @@
           <w:szCs w:val="22"/>
         </w:rPr>
       </w:pPr>
-      <w:hyperlink r:id="rId27" w:history="1">
+      <w:hyperlink r:id="rId31" w:history="1">
         <w:r>
           <w:rPr>
             <w:rStyle w:val="ae"/>
@@ -760,7 +864,7 @@
           <w:szCs w:val="22"/>
         </w:rPr>
       </w:pPr>
-      <w:hyperlink r:id="rId28" w:history="1">
+      <w:hyperlink r:id="rId32" w:history="1">
         <w:r>
           <w:rPr>
             <w:rStyle w:val="ae"/>
@@ -784,7 +888,7 @@
           <w:szCs w:val="22"/>
         </w:rPr>
       </w:pPr>
-      <w:hyperlink r:id="rId29" w:history="1">
+      <w:hyperlink r:id="rId33" w:history="1">
         <w:r>
           <w:rPr>
             <w:rStyle w:val="ae"/>
@@ -808,7 +912,7 @@
           <w:szCs w:val="22"/>
         </w:rPr>
       </w:pPr>
-      <w:hyperlink r:id="rId30" w:history="1">
+      <w:hyperlink r:id="rId34" w:history="1">
         <w:r>
           <w:rPr>
             <w:rStyle w:val="ae"/>
@@ -853,7 +957,7 @@
           <w:szCs w:val="22"/>
         </w:rPr>
       </w:pPr>
-      <w:hyperlink r:id="rId31" w:history="1">
+      <w:hyperlink r:id="rId35" w:history="1">
         <w:r>
           <w:rPr>
             <w:rStyle w:val="ae"/>
@@ -877,7 +981,7 @@
           <w:szCs w:val="22"/>
         </w:rPr>
       </w:pPr>
-      <w:hyperlink r:id="rId32" w:tgtFrame="_new" w:history="1">
+      <w:hyperlink r:id="rId36" w:tgtFrame="_new" w:history="1">
         <w:r>
           <w:rPr>
             <w:rStyle w:val="ae"/>
@@ -901,7 +1005,7 @@
           <w:szCs w:val="22"/>
         </w:rPr>
       </w:pPr>
-      <w:hyperlink r:id="rId33" w:tgtFrame="_new" w:history="1">
+      <w:hyperlink r:id="rId37" w:tgtFrame="_new" w:history="1">
         <w:r>
           <w:rPr>
             <w:rStyle w:val="ae"/>
@@ -925,7 +1029,7 @@
           <w:szCs w:val="22"/>
         </w:rPr>
       </w:pPr>
-      <w:hyperlink r:id="rId34" w:tgtFrame="_new" w:history="1">
+      <w:hyperlink r:id="rId38" w:tgtFrame="_new" w:history="1">
         <w:r>
           <w:rPr>
             <w:rStyle w:val="ae"/>
@@ -949,7 +1053,7 @@
           <w:szCs w:val="22"/>
         </w:rPr>
       </w:pPr>
-      <w:hyperlink r:id="rId35" w:tgtFrame="_new" w:history="1">
+      <w:hyperlink r:id="rId39" w:tgtFrame="_new" w:history="1">
         <w:r>
           <w:rPr>
             <w:rStyle w:val="ae"/>
@@ -994,7 +1098,7 @@
           <w:szCs w:val="22"/>
         </w:rPr>
       </w:pPr>
-      <w:hyperlink r:id="rId36" w:history="1">
+      <w:hyperlink r:id="rId40" w:history="1">
         <w:r>
           <w:rPr>
             <w:rStyle w:val="ae"/>
@@ -1020,7 +1124,7 @@
           <w:szCs w:val="22"/>
         </w:rPr>
       </w:pPr>
-      <w:hyperlink r:id="rId37" w:tgtFrame="_new" w:history="1">
+      <w:hyperlink r:id="rId41" w:tgtFrame="_new" w:history="1">
         <w:r>
           <w:rPr>
             <w:rStyle w:val="ae"/>
@@ -1065,7 +1169,7 @@
           <w:szCs w:val="22"/>
         </w:rPr>
       </w:pPr>
-      <w:hyperlink r:id="rId38" w:history="1">
+      <w:hyperlink r:id="rId42" w:history="1">
         <w:r>
           <w:rPr>
             <w:rStyle w:val="ae"/>
@@ -1103,6 +1207,7 @@
           <w:sz w:val="22"/>
           <w:szCs w:val="22"/>
         </w:rPr>
+        <w:lastRenderedPageBreak/>
         <w:t>Inspiration &amp; Ideas</w:t>
       </w:r>
     </w:p>
@@ -1118,7 +1223,7 @@
           <w:szCs w:val="22"/>
         </w:rPr>
       </w:pPr>
-      <w:hyperlink r:id="rId39" w:history="1">
+      <w:hyperlink r:id="rId43" w:history="1">
         <w:r>
           <w:rPr>
             <w:rStyle w:val="ae"/>
@@ -1142,7 +1247,7 @@
           <w:szCs w:val="22"/>
         </w:rPr>
       </w:pPr>
-      <w:hyperlink r:id="rId40" w:history="1">
+      <w:hyperlink r:id="rId44" w:history="1">
         <w:r>
           <w:rPr>
             <w:rStyle w:val="ae"/>
@@ -1166,7 +1271,7 @@
           <w:szCs w:val="22"/>
         </w:rPr>
       </w:pPr>
-      <w:hyperlink r:id="rId41" w:history="1">
+      <w:hyperlink r:id="rId45" w:history="1">
         <w:r>
           <w:rPr>
             <w:rStyle w:val="ae"/>
@@ -1190,7 +1295,7 @@
           <w:szCs w:val="22"/>
         </w:rPr>
       </w:pPr>
-      <w:hyperlink r:id="rId42" w:history="1">
+      <w:hyperlink r:id="rId46" w:history="1">
         <w:r>
           <w:rPr>
             <w:rStyle w:val="ae"/>
@@ -1275,7 +1380,7 @@
           <w:szCs w:val="22"/>
         </w:rPr>
       </w:pPr>
-      <w:hyperlink r:id="rId43" w:history="1">
+      <w:hyperlink r:id="rId47" w:history="1">
         <w:r>
           <w:rPr>
             <w:rStyle w:val="ae"/>
@@ -1299,7 +1404,7 @@
           <w:szCs w:val="22"/>
         </w:rPr>
       </w:pPr>
-      <w:hyperlink r:id="rId44" w:anchor="goog_game_inter" w:history="1">
+      <w:hyperlink r:id="rId48" w:anchor="goog_game_inter" w:history="1">
         <w:r>
           <w:rPr>
             <w:rStyle w:val="ae"/>
@@ -1331,7 +1436,7 @@
           <w:szCs w:val="22"/>
         </w:rPr>
       </w:pPr>
-      <w:hyperlink r:id="rId45" w:history="1">
+      <w:hyperlink r:id="rId49" w:history="1">
         <w:r>
           <w:rPr>
             <w:rStyle w:val="ae"/>
@@ -1350,7 +1455,7 @@
         </w:rPr>
         <w:t xml:space="preserve"> - A fully functional Monopoly game in JavaScript, open-source on </w:t>
       </w:r>
-      <w:hyperlink r:id="rId46" w:history="1">
+      <w:hyperlink r:id="rId50" w:history="1">
         <w:r>
           <w:rPr>
             <w:rStyle w:val="ae"/>
@@ -1382,7 +1487,7 @@
           <w:szCs w:val="22"/>
         </w:rPr>
       </w:pPr>
-      <w:hyperlink r:id="rId47" w:history="1">
+      <w:hyperlink r:id="rId51" w:history="1">
         <w:r>
           <w:rPr>
             <w:rStyle w:val="ae"/>
@@ -1414,7 +1519,7 @@
           <w:szCs w:val="22"/>
         </w:rPr>
       </w:pPr>
-      <w:hyperlink r:id="rId48" w:history="1">
+      <w:hyperlink r:id="rId52" w:history="1">
         <w:r>
           <w:rPr>
             <w:rStyle w:val="ae"/>

</xml_diff>

<commit_message>
Formatting code with Black Formatter
Formatting code with Black Formatter by Microsoft:https://marketplace.visualstudio.com/items/?itemName=ms-python.black-formatter
</commit_message>
<xml_diff>
--- a/Process Documents/Used resources.docx
+++ b/Process Documents/Used resources.docx
@@ -1138,6 +1138,78 @@
     </w:p>
     <w:p>
       <w:pPr>
+        <w:widowControl/>
+        <w:numPr>
+          <w:ilvl w:val="0"/>
+          <w:numId w:val="5"/>
+        </w:numPr>
+        <w:spacing w:before="100" w:beforeAutospacing="1" w:after="100" w:afterAutospacing="1" w:line="240" w:lineRule="auto"/>
+        <w:rPr>
+          <w:rFonts w:ascii="Arial" w:hAnsi="Arial" w:cs="Arial"/>
+          <w:sz w:val="22"/>
+          <w:szCs w:val="22"/>
+        </w:rPr>
+      </w:pPr>
+      <w:hyperlink r:id="rId42" w:history="1">
+        <w:r>
+          <w:rPr>
+            <w:rStyle w:val="ae"/>
+            <w:rFonts w:ascii="Arial" w:hAnsi="Arial" w:cs="Arial"/>
+            <w:sz w:val="22"/>
+            <w:szCs w:val="22"/>
+          </w:rPr>
+          <w:t>https://www.youtube.com/watch?v=n8EtFlaSRVM&amp;t=371s</w:t>
+        </w:r>
+      </w:hyperlink>
+    </w:p>
+    <w:p>
+      <w:pPr>
+        <w:widowControl/>
+        <w:numPr>
+          <w:ilvl w:val="0"/>
+          <w:numId w:val="5"/>
+        </w:numPr>
+        <w:spacing w:before="100" w:beforeAutospacing="1" w:after="100" w:afterAutospacing="1" w:line="240" w:lineRule="auto"/>
+        <w:rPr>
+          <w:rFonts w:ascii="Arial" w:hAnsi="Arial" w:cs="Arial"/>
+          <w:sz w:val="22"/>
+          <w:szCs w:val="22"/>
+        </w:rPr>
+      </w:pPr>
+      <w:r>
+        <w:rPr>
+          <w:rFonts w:ascii="Arial" w:hAnsi="Arial" w:cs="Arial"/>
+          <w:sz w:val="22"/>
+          <w:szCs w:val="22"/>
+        </w:rPr>
+        <w:t>How to Format Python Code on Save in Visual Studio Code</w:t>
+      </w:r>
+    </w:p>
+    <w:p>
+      <w:pPr>
+        <w:widowControl/>
+        <w:numPr>
+          <w:ilvl w:val="0"/>
+          <w:numId w:val="5"/>
+        </w:numPr>
+        <w:spacing w:before="100" w:beforeAutospacing="1" w:after="100" w:afterAutospacing="1" w:line="240" w:lineRule="auto"/>
+        <w:rPr>
+          <w:rFonts w:ascii="Arial" w:hAnsi="Arial" w:cs="Arial"/>
+          <w:sz w:val="22"/>
+          <w:szCs w:val="22"/>
+        </w:rPr>
+      </w:pPr>
+      <w:r>
+        <w:rPr>
+          <w:rFonts w:ascii="Arial" w:hAnsi="Arial" w:cs="Arial"/>
+          <w:sz w:val="22"/>
+          <w:szCs w:val="22"/>
+        </w:rPr>
+        <w:t>https://marketplace.visualstudio.com/items/?itemName=ms-python.black-formatter</w:t>
+      </w:r>
+    </w:p>
+    <w:p>
+      <w:pPr>
         <w:pStyle w:val="3"/>
         <w:rPr>
           <w:rFonts w:ascii="Arial" w:hAnsi="Arial" w:cs="Arial"/>
@@ -1154,6 +1226,7 @@
           <w:sz w:val="22"/>
           <w:szCs w:val="22"/>
         </w:rPr>
+        <w:lastRenderedPageBreak/>
         <w:t>Game User Research</w:t>
       </w:r>
     </w:p>
@@ -1169,7 +1242,7 @@
           <w:szCs w:val="22"/>
         </w:rPr>
       </w:pPr>
-      <w:hyperlink r:id="rId42" w:history="1">
+      <w:hyperlink r:id="rId43" w:history="1">
         <w:r>
           <w:rPr>
             <w:rStyle w:val="ae"/>
@@ -1207,7 +1280,6 @@
           <w:sz w:val="22"/>
           <w:szCs w:val="22"/>
         </w:rPr>
-        <w:lastRenderedPageBreak/>
         <w:t>Inspiration &amp; Ideas</w:t>
       </w:r>
     </w:p>
@@ -1223,7 +1295,7 @@
           <w:szCs w:val="22"/>
         </w:rPr>
       </w:pPr>
-      <w:hyperlink r:id="rId43" w:history="1">
+      <w:hyperlink r:id="rId44" w:history="1">
         <w:r>
           <w:rPr>
             <w:rStyle w:val="ae"/>
@@ -1247,7 +1319,7 @@
           <w:szCs w:val="22"/>
         </w:rPr>
       </w:pPr>
-      <w:hyperlink r:id="rId44" w:history="1">
+      <w:hyperlink r:id="rId45" w:history="1">
         <w:r>
           <w:rPr>
             <w:rStyle w:val="ae"/>
@@ -1271,7 +1343,7 @@
           <w:szCs w:val="22"/>
         </w:rPr>
       </w:pPr>
-      <w:hyperlink r:id="rId45" w:history="1">
+      <w:hyperlink r:id="rId46" w:history="1">
         <w:r>
           <w:rPr>
             <w:rStyle w:val="ae"/>
@@ -1295,7 +1367,7 @@
           <w:szCs w:val="22"/>
         </w:rPr>
       </w:pPr>
-      <w:hyperlink r:id="rId46" w:history="1">
+      <w:hyperlink r:id="rId47" w:history="1">
         <w:r>
           <w:rPr>
             <w:rStyle w:val="ae"/>
@@ -1380,7 +1452,7 @@
           <w:szCs w:val="22"/>
         </w:rPr>
       </w:pPr>
-      <w:hyperlink r:id="rId47" w:history="1">
+      <w:hyperlink r:id="rId48" w:history="1">
         <w:r>
           <w:rPr>
             <w:rStyle w:val="ae"/>
@@ -1404,7 +1476,7 @@
           <w:szCs w:val="22"/>
         </w:rPr>
       </w:pPr>
-      <w:hyperlink r:id="rId48" w:anchor="goog_game_inter" w:history="1">
+      <w:hyperlink r:id="rId49" w:anchor="goog_game_inter" w:history="1">
         <w:r>
           <w:rPr>
             <w:rStyle w:val="ae"/>
@@ -1436,7 +1508,7 @@
           <w:szCs w:val="22"/>
         </w:rPr>
       </w:pPr>
-      <w:hyperlink r:id="rId49" w:history="1">
+      <w:hyperlink r:id="rId50" w:history="1">
         <w:r>
           <w:rPr>
             <w:rStyle w:val="ae"/>
@@ -1455,7 +1527,7 @@
         </w:rPr>
         <w:t xml:space="preserve"> - A fully functional Monopoly game in JavaScript, open-source on </w:t>
       </w:r>
-      <w:hyperlink r:id="rId50" w:history="1">
+      <w:hyperlink r:id="rId51" w:history="1">
         <w:r>
           <w:rPr>
             <w:rStyle w:val="ae"/>
@@ -1487,7 +1559,7 @@
           <w:szCs w:val="22"/>
         </w:rPr>
       </w:pPr>
-      <w:hyperlink r:id="rId51" w:history="1">
+      <w:hyperlink r:id="rId52" w:history="1">
         <w:r>
           <w:rPr>
             <w:rStyle w:val="ae"/>
@@ -1519,7 +1591,7 @@
           <w:szCs w:val="22"/>
         </w:rPr>
       </w:pPr>
-      <w:hyperlink r:id="rId52" w:history="1">
+      <w:hyperlink r:id="rId53" w:history="1">
         <w:r>
           <w:rPr>
             <w:rStyle w:val="ae"/>

</xml_diff>

<commit_message>
add development mode property stars
</commit_message>
<xml_diff>
--- a/Process Documents/Used resources.docx
+++ b/Process Documents/Used resources.docx
@@ -1619,6 +1619,259 @@
           <w:szCs w:val="22"/>
         </w:rPr>
       </w:pPr>
+      <w:r>
+        <w:rPr>
+          <w:rFonts w:ascii="Arial" w:hAnsi="Arial" w:cs="Arial" w:hint="eastAsia"/>
+          <w:sz w:val="22"/>
+          <w:szCs w:val="22"/>
+        </w:rPr>
+        <w:t xml:space="preserve">Sound: </w:t>
+      </w:r>
+      <w:hyperlink r:id="rId54" w:history="1">
+        <w:r>
+          <w:rPr>
+            <w:rStyle w:val="ae"/>
+            <w:rFonts w:ascii="Arial" w:hAnsi="Arial" w:cs="Arial"/>
+            <w:sz w:val="22"/>
+            <w:szCs w:val="22"/>
+          </w:rPr>
+          <w:t>https://pixabay.com/sound-effects/dice-142528/</w:t>
+        </w:r>
+      </w:hyperlink>
+    </w:p>
+    <w:p>
+      <w:pPr>
+        <w:rPr>
+          <w:rFonts w:ascii="Arial" w:hAnsi="Arial" w:cs="Arial"/>
+          <w:sz w:val="22"/>
+          <w:szCs w:val="22"/>
+        </w:rPr>
+      </w:pPr>
+      <w:hyperlink r:id="rId55" w:history="1">
+        <w:r>
+          <w:rPr>
+            <w:rStyle w:val="ae"/>
+            <w:rFonts w:ascii="Arial" w:hAnsi="Arial" w:cs="Arial"/>
+            <w:sz w:val="22"/>
+            <w:szCs w:val="22"/>
+          </w:rPr>
+          <w:t>https://tuna.voicemod.net/sound/719f1389-c249-4c39-a161-2cb267178036</w:t>
+        </w:r>
+      </w:hyperlink>
+    </w:p>
+    <w:p>
+      <w:pPr>
+        <w:rPr>
+          <w:rFonts w:ascii="Arial" w:hAnsi="Arial" w:cs="Arial"/>
+          <w:sz w:val="22"/>
+          <w:szCs w:val="22"/>
+        </w:rPr>
+      </w:pPr>
+      <w:hyperlink r:id="rId56" w:history="1">
+        <w:r>
+          <w:rPr>
+            <w:rStyle w:val="ae"/>
+            <w:rFonts w:ascii="Arial" w:hAnsi="Arial" w:cs="Arial"/>
+            <w:sz w:val="22"/>
+            <w:szCs w:val="22"/>
+          </w:rPr>
+          <w:t>https://tuna.voicemod.net/sound/00a9071e-8ed6-4f29-af49-c9005466f41d</w:t>
+        </w:r>
+      </w:hyperlink>
+    </w:p>
+    <w:p>
+      <w:pPr>
+        <w:rPr>
+          <w:rFonts w:ascii="Arial" w:hAnsi="Arial" w:cs="Arial"/>
+          <w:sz w:val="22"/>
+          <w:szCs w:val="22"/>
+        </w:rPr>
+      </w:pPr>
+      <w:hyperlink r:id="rId57" w:history="1">
+        <w:r>
+          <w:rPr>
+            <w:rStyle w:val="ae"/>
+            <w:rFonts w:ascii="Arial" w:hAnsi="Arial" w:cs="Arial"/>
+            <w:sz w:val="22"/>
+            <w:szCs w:val="22"/>
+          </w:rPr>
+          <w:t>https://pixabay.com/sound-effects/place-100513/</w:t>
+        </w:r>
+      </w:hyperlink>
+    </w:p>
+    <w:p>
+      <w:pPr>
+        <w:rPr>
+          <w:rFonts w:ascii="Arial" w:hAnsi="Arial" w:cs="Arial"/>
+          <w:sz w:val="22"/>
+          <w:szCs w:val="22"/>
+        </w:rPr>
+      </w:pPr>
+      <w:r>
+        <w:rPr>
+          <w:rFonts w:ascii="Arial" w:hAnsi="Arial" w:cs="Arial"/>
+          <w:sz w:val="22"/>
+          <w:szCs w:val="22"/>
+        </w:rPr>
+        <w:t>Sound Effect by </w:t>
+      </w:r>
+      <w:hyperlink r:id="rId58" w:history="1">
+        <w:r>
+          <w:rPr>
+            <w:rStyle w:val="ae"/>
+            <w:rFonts w:ascii="Arial" w:hAnsi="Arial" w:cs="Arial"/>
+            <w:sz w:val="22"/>
+            <w:szCs w:val="22"/>
+          </w:rPr>
+          <w:t>Modestas123123</w:t>
+        </w:r>
+      </w:hyperlink>
+      <w:r>
+        <w:rPr>
+          <w:rFonts w:ascii="Arial" w:hAnsi="Arial" w:cs="Arial"/>
+          <w:sz w:val="22"/>
+          <w:szCs w:val="22"/>
+        </w:rPr>
+        <w:t> from </w:t>
+      </w:r>
+      <w:hyperlink r:id="rId59" w:history="1">
+        <w:r>
+          <w:rPr>
+            <w:rStyle w:val="ae"/>
+            <w:rFonts w:ascii="Arial" w:hAnsi="Arial" w:cs="Arial"/>
+            <w:sz w:val="22"/>
+            <w:szCs w:val="22"/>
+          </w:rPr>
+          <w:t>Pixabay</w:t>
+        </w:r>
+      </w:hyperlink>
+    </w:p>
+    <w:p>
+      <w:pPr>
+        <w:rPr>
+          <w:rFonts w:ascii="Arial" w:hAnsi="Arial" w:cs="Arial"/>
+          <w:sz w:val="22"/>
+          <w:szCs w:val="22"/>
+        </w:rPr>
+      </w:pPr>
+      <w:hyperlink r:id="rId60" w:history="1">
+        <w:r>
+          <w:rPr>
+            <w:rStyle w:val="ae"/>
+            <w:rFonts w:ascii="Arial" w:hAnsi="Arial" w:cs="Arial"/>
+            <w:sz w:val="22"/>
+            <w:szCs w:val="22"/>
+          </w:rPr>
+          <w:t>https://pixabay.com/sound-effects/cash-register-kaching-sound-effect-125042/</w:t>
+        </w:r>
+      </w:hyperlink>
+    </w:p>
+    <w:p>
+      <w:pPr>
+        <w:rPr>
+          <w:rFonts w:ascii="Arial" w:hAnsi="Arial" w:cs="Arial"/>
+          <w:sz w:val="22"/>
+          <w:szCs w:val="22"/>
+        </w:rPr>
+      </w:pPr>
+      <w:hyperlink r:id="rId61" w:history="1">
+        <w:r>
+          <w:rPr>
+            <w:rStyle w:val="ae"/>
+            <w:rFonts w:ascii="Arial" w:hAnsi="Arial" w:cs="Arial"/>
+            <w:sz w:val="22"/>
+            <w:szCs w:val="22"/>
+          </w:rPr>
+          <w:t>https://pixabay.com/sound-effects/coin-257878/</w:t>
+        </w:r>
+      </w:hyperlink>
+    </w:p>
+    <w:p>
+      <w:pPr>
+        <w:rPr>
+          <w:rFonts w:ascii="Arial" w:hAnsi="Arial" w:cs="Arial"/>
+          <w:sz w:val="22"/>
+          <w:szCs w:val="22"/>
+        </w:rPr>
+      </w:pPr>
+      <w:hyperlink r:id="rId62" w:history="1">
+        <w:r>
+          <w:rPr>
+            <w:rStyle w:val="ae"/>
+            <w:rFonts w:ascii="Arial" w:hAnsi="Arial" w:cs="Arial"/>
+            <w:sz w:val="22"/>
+            <w:szCs w:val="22"/>
+          </w:rPr>
+          <w:t>https://pixabay.com/sound-effects/game-over-classic-206486/</w:t>
+        </w:r>
+      </w:hyperlink>
+    </w:p>
+    <w:p>
+      <w:pPr>
+        <w:rPr>
+          <w:rFonts w:ascii="Arial" w:hAnsi="Arial" w:cs="Arial"/>
+          <w:sz w:val="22"/>
+          <w:szCs w:val="22"/>
+        </w:rPr>
+      </w:pPr>
+      <w:hyperlink r:id="rId63" w:history="1">
+        <w:r>
+          <w:rPr>
+            <w:rStyle w:val="ae"/>
+            <w:rFonts w:ascii="Arial" w:hAnsi="Arial" w:cs="Arial"/>
+            <w:sz w:val="22"/>
+            <w:szCs w:val="22"/>
+          </w:rPr>
+          <w:t>https://pixabay.com/sound-effects/cashier-quotka-chingquot-sound-effect-129698/</w:t>
+        </w:r>
+      </w:hyperlink>
+    </w:p>
+    <w:p>
+      <w:hyperlink r:id="rId64" w:history="1">
+        <w:r>
+          <w:rPr>
+            <w:rStyle w:val="ae"/>
+            <w:rFonts w:ascii="Arial" w:hAnsi="Arial" w:cs="Arial"/>
+            <w:sz w:val="22"/>
+            <w:szCs w:val="22"/>
+          </w:rPr>
+          <w:t>https://pixabay.com/sound-effects/menuselect4-36147/</w:t>
+        </w:r>
+      </w:hyperlink>
+    </w:p>
+    <w:p>
+      <w:pPr>
+        <w:rPr>
+          <w:rFonts w:ascii="Arial" w:hAnsi="Arial" w:cs="Arial"/>
+          <w:sz w:val="22"/>
+          <w:szCs w:val="22"/>
+        </w:rPr>
+      </w:pPr>
+      <w:r>
+        <w:rPr>
+          <w:rFonts w:ascii="Arial" w:hAnsi="Arial" w:cs="Arial"/>
+          <w:sz w:val="22"/>
+          <w:szCs w:val="22"/>
+        </w:rPr>
+        <w:t>https://pixabay.com/sound-effects/winsquare-6993/</w:t>
+      </w:r>
+    </w:p>
+    <w:p>
+      <w:pPr>
+        <w:rPr>
+          <w:rFonts w:ascii="Arial" w:hAnsi="Arial" w:cs="Arial"/>
+          <w:sz w:val="22"/>
+          <w:szCs w:val="22"/>
+        </w:rPr>
+      </w:pPr>
+      <w:r>
+        <w:rPr>
+          <w:rFonts w:ascii="Arial" w:hAnsi="Arial" w:cs="Arial"/>
+          <w:sz w:val="22"/>
+          <w:szCs w:val="22"/>
+        </w:rPr>
+        <w:t>https://pixabay.com/music/video-games-game-176807/</w:t>
+      </w:r>
     </w:p>
     <w:sectPr>
       <w:pgSz w:w="11906" w:h="16838"/>

</xml_diff>

<commit_message>
Improve "abridged" mode UI
</commit_message>
<xml_diff>
--- a/Process Documents/Used resources.docx
+++ b/Process Documents/Used resources.docx
@@ -1864,13 +1864,93 @@
           <w:szCs w:val="22"/>
         </w:rPr>
       </w:pPr>
+      <w:hyperlink r:id="rId65" w:history="1">
+        <w:r>
+          <w:rPr>
+            <w:rStyle w:val="ae"/>
+            <w:rFonts w:ascii="Arial" w:hAnsi="Arial" w:cs="Arial"/>
+            <w:sz w:val="22"/>
+            <w:szCs w:val="22"/>
+          </w:rPr>
+          <w:t>https://pixabay.com/music/video-games-game-176807/</w:t>
+        </w:r>
+      </w:hyperlink>
+    </w:p>
+    <w:p>
+      <w:pPr>
+        <w:rPr>
+          <w:rFonts w:ascii="Arial" w:hAnsi="Arial" w:cs="Arial"/>
+          <w:sz w:val="22"/>
+          <w:szCs w:val="22"/>
+        </w:rPr>
+      </w:pPr>
+      <w:hyperlink r:id="rId66" w:history="1">
+        <w:r>
+          <w:rPr>
+            <w:rStyle w:val="ae"/>
+            <w:rFonts w:ascii="Arial" w:hAnsi="Arial" w:cs="Arial"/>
+            <w:sz w:val="22"/>
+            <w:szCs w:val="22"/>
+          </w:rPr>
+          <w:t>https://pixabay.com/sound-effects/time-passing-sound-effect-fast-clock-108403/</w:t>
+        </w:r>
+      </w:hyperlink>
+    </w:p>
+    <w:p>
+      <w:pPr>
+        <w:rPr>
+          <w:rFonts w:ascii="Arial" w:hAnsi="Arial" w:cs="Arial"/>
+          <w:sz w:val="22"/>
+          <w:szCs w:val="22"/>
+        </w:rPr>
+      </w:pPr>
+      <w:hyperlink r:id="rId67" w:history="1">
+        <w:r>
+          <w:rPr>
+            <w:rStyle w:val="ae"/>
+            <w:rFonts w:ascii="Arial" w:hAnsi="Arial" w:cs="Arial"/>
+            <w:sz w:val="22"/>
+            <w:szCs w:val="22"/>
+          </w:rPr>
+          <w:t>https://pixabay.com/sound-effects/logo-piano-125764/</w:t>
+        </w:r>
+      </w:hyperlink>
+    </w:p>
+    <w:p>
+      <w:pPr>
+        <w:rPr>
+          <w:rFonts w:ascii="Arial" w:hAnsi="Arial" w:cs="Arial"/>
+          <w:sz w:val="22"/>
+          <w:szCs w:val="22"/>
+        </w:rPr>
+      </w:pPr>
+      <w:hyperlink r:id="rId68" w:history="1">
+        <w:r>
+          <w:rPr>
+            <w:rStyle w:val="ae"/>
+            <w:rFonts w:ascii="Arial" w:hAnsi="Arial" w:cs="Arial"/>
+            <w:sz w:val="22"/>
+            <w:szCs w:val="22"/>
+          </w:rPr>
+          <w:t>https://www.zedge.net/ringtones/484ea82f-4d9d-3660-b7d4-3017ecc0d46f</w:t>
+        </w:r>
+      </w:hyperlink>
+    </w:p>
+    <w:p>
+      <w:pPr>
+        <w:rPr>
+          <w:rFonts w:ascii="Arial" w:hAnsi="Arial" w:cs="Arial" w:hint="eastAsia"/>
+          <w:sz w:val="22"/>
+          <w:szCs w:val="22"/>
+        </w:rPr>
+      </w:pPr>
       <w:r>
         <w:rPr>
           <w:rFonts w:ascii="Arial" w:hAnsi="Arial" w:cs="Arial"/>
           <w:sz w:val="22"/>
           <w:szCs w:val="22"/>
         </w:rPr>
-        <w:t>https://pixabay.com/music/video-games-game-176807/</w:t>
+        <w:t>https://pixabay.com/sound-effects/family-store-logo-13175/</w:t>
       </w:r>
     </w:p>
     <w:sectPr>

</xml_diff>

<commit_message>
Add code scanning results doc
</commit_message>
<xml_diff>
--- a/Process Documents/Used resources.docx
+++ b/Process Documents/Used resources.docx
@@ -49,63 +49,6 @@
           <w:szCs w:val="22"/>
         </w:rPr>
         <w:t>Below is a list of resources that helped us create the game. This is only a portion of the references we used; we also appreciate other resources that are not listed here.</w:t>
-      </w:r>
-    </w:p>
-    <w:p>
-      <w:pPr>
-        <w:rPr>
-          <w:rFonts w:ascii="Arial" w:hAnsi="Arial" w:cs="Arial"/>
-          <w:sz w:val="22"/>
-          <w:szCs w:val="22"/>
-        </w:rPr>
-      </w:pPr>
-      <w:r>
-        <w:rPr>
-          <w:rFonts w:ascii="Arial" w:hAnsi="Arial" w:cs="Arial"/>
-          <w:b/>
-          <w:bCs/>
-          <w:sz w:val="22"/>
-          <w:szCs w:val="22"/>
-        </w:rPr>
-        <w:t>Special Thanks</w:t>
-      </w:r>
-      <w:r>
-        <w:rPr>
-          <w:rFonts w:ascii="Arial" w:hAnsi="Arial" w:cs="Arial" w:hint="eastAsia"/>
-          <w:sz w:val="22"/>
-          <w:szCs w:val="22"/>
-        </w:rPr>
-        <w:t>:</w:t>
-      </w:r>
-    </w:p>
-    <w:p>
-      <w:pPr>
-        <w:rPr>
-          <w:rFonts w:ascii="Arial" w:hAnsi="Arial" w:cs="Arial"/>
-          <w:sz w:val="22"/>
-          <w:szCs w:val="22"/>
-        </w:rPr>
-      </w:pPr>
-    </w:p>
-    <w:p>
-      <w:pPr>
-        <w:rPr>
-          <w:rFonts w:ascii="Arial" w:hAnsi="Arial" w:cs="Arial"/>
-          <w:b/>
-          <w:bCs/>
-          <w:sz w:val="22"/>
-          <w:szCs w:val="22"/>
-        </w:rPr>
-      </w:pPr>
-      <w:r>
-        <w:rPr>
-          <w:rFonts w:ascii="Arial" w:hAnsi="Arial" w:cs="Arial"/>
-          <w:b/>
-          <w:bCs/>
-          <w:sz w:val="22"/>
-          <w:szCs w:val="22"/>
-        </w:rPr>
-        <w:t>General</w:t>
       </w:r>
     </w:p>
     <w:p>
@@ -394,51 +337,6 @@
     </w:p>
     <w:p>
       <w:pPr>
-        <w:widowControl/>
-        <w:numPr>
-          <w:ilvl w:val="0"/>
-          <w:numId w:val="1"/>
-        </w:numPr>
-        <w:spacing w:before="100" w:beforeAutospacing="1" w:after="100" w:afterAutospacing="1" w:line="240" w:lineRule="auto"/>
-        <w:rPr>
-          <w:rFonts w:ascii="Arial" w:hAnsi="Arial" w:cs="Arial"/>
-          <w:sz w:val="22"/>
-          <w:szCs w:val="22"/>
-        </w:rPr>
-      </w:pPr>
-      <w:r>
-        <w:rPr>
-          <w:rFonts w:ascii="Arial" w:hAnsi="Arial" w:cs="Arial"/>
-          <w:sz w:val="22"/>
-          <w:szCs w:val="22"/>
-        </w:rPr>
-        <w:t>.</w:t>
-      </w:r>
-    </w:p>
-    <w:p>
-      <w:pPr>
-        <w:pStyle w:val="3"/>
-        <w:rPr>
-          <w:rFonts w:ascii="Arial" w:hAnsi="Arial" w:cs="Arial"/>
-          <w:color w:val="auto"/>
-          <w:sz w:val="22"/>
-          <w:szCs w:val="22"/>
-        </w:rPr>
-      </w:pPr>
-      <w:r>
-        <w:rPr>
-          <w:rFonts w:ascii="Arial" w:hAnsi="Arial" w:cs="Arial"/>
-          <w:b/>
-          <w:bCs/>
-          <w:color w:val="auto"/>
-          <w:sz w:val="22"/>
-          <w:szCs w:val="22"/>
-        </w:rPr>
-        <w:t>Reading Excel Files</w:t>
-      </w:r>
-    </w:p>
-    <w:p>
-      <w:pPr>
         <w:numPr>
           <w:ilvl w:val="0"/>
           <w:numId w:val="9"/>
@@ -511,27 +409,6 @@
     </w:p>
     <w:p>
       <w:pPr>
-        <w:rPr>
-          <w:rFonts w:ascii="Arial" w:hAnsi="Arial" w:cs="Arial"/>
-          <w:b/>
-          <w:bCs/>
-          <w:sz w:val="22"/>
-          <w:szCs w:val="22"/>
-        </w:rPr>
-      </w:pPr>
-      <w:r>
-        <w:rPr>
-          <w:rFonts w:ascii="Arial" w:hAnsi="Arial" w:cs="Arial"/>
-          <w:b/>
-          <w:bCs/>
-          <w:sz w:val="22"/>
-          <w:szCs w:val="22"/>
-        </w:rPr>
-        <w:t>Pygame Lag Problem Fix</w:t>
-      </w:r>
-    </w:p>
-    <w:p>
-      <w:pPr>
         <w:numPr>
           <w:ilvl w:val="0"/>
           <w:numId w:val="2"/>
@@ -644,27 +521,6 @@
     </w:p>
     <w:p>
       <w:pPr>
-        <w:rPr>
-          <w:rFonts w:ascii="Arial" w:hAnsi="Arial" w:cs="Arial"/>
-          <w:b/>
-          <w:bCs/>
-          <w:sz w:val="22"/>
-          <w:szCs w:val="22"/>
-        </w:rPr>
-      </w:pPr>
-      <w:r>
-        <w:rPr>
-          <w:rFonts w:ascii="Arial" w:hAnsi="Arial" w:cs="Arial"/>
-          <w:b/>
-          <w:bCs/>
-          <w:sz w:val="22"/>
-          <w:szCs w:val="22"/>
-        </w:rPr>
-        <w:t>Game Idea</w:t>
-      </w:r>
-    </w:p>
-    <w:p>
-      <w:pPr>
         <w:numPr>
           <w:ilvl w:val="0"/>
           <w:numId w:val="3"/>
@@ -737,27 +593,6 @@
     </w:p>
     <w:p>
       <w:pPr>
-        <w:rPr>
-          <w:rFonts w:ascii="Arial" w:hAnsi="Arial" w:cs="Arial"/>
-          <w:b/>
-          <w:bCs/>
-          <w:sz w:val="22"/>
-          <w:szCs w:val="22"/>
-        </w:rPr>
-      </w:pPr>
-      <w:r>
-        <w:rPr>
-          <w:rFonts w:ascii="Arial" w:hAnsi="Arial" w:cs="Arial"/>
-          <w:b/>
-          <w:bCs/>
-          <w:sz w:val="22"/>
-          <w:szCs w:val="22"/>
-        </w:rPr>
-        <w:t>Packing</w:t>
-      </w:r>
-    </w:p>
-    <w:p>
-      <w:pPr>
         <w:numPr>
           <w:ilvl w:val="0"/>
           <w:numId w:val="4"/>
@@ -926,27 +761,6 @@
     </w:p>
     <w:p>
       <w:pPr>
-        <w:rPr>
-          <w:rFonts w:ascii="Arial" w:hAnsi="Arial" w:cs="Arial"/>
-          <w:b/>
-          <w:bCs/>
-          <w:sz w:val="22"/>
-          <w:szCs w:val="22"/>
-        </w:rPr>
-      </w:pPr>
-      <w:r>
-        <w:rPr>
-          <w:rFonts w:ascii="Arial" w:hAnsi="Arial" w:cs="Arial"/>
-          <w:b/>
-          <w:bCs/>
-          <w:sz w:val="22"/>
-          <w:szCs w:val="22"/>
-        </w:rPr>
-        <w:t>Documentation &amp; Deployment</w:t>
-      </w:r>
-    </w:p>
-    <w:p>
-      <w:pPr>
         <w:numPr>
           <w:ilvl w:val="0"/>
           <w:numId w:val="11"/>
@@ -1064,27 +878,6 @@
           <w:t>Building and Testing Python with GitHub Actions</w:t>
         </w:r>
       </w:hyperlink>
-    </w:p>
-    <w:p>
-      <w:pPr>
-        <w:rPr>
-          <w:rFonts w:ascii="Arial" w:hAnsi="Arial" w:cs="Arial"/>
-          <w:b/>
-          <w:bCs/>
-          <w:sz w:val="22"/>
-          <w:szCs w:val="22"/>
-        </w:rPr>
-      </w:pPr>
-      <w:r>
-        <w:rPr>
-          <w:rFonts w:ascii="Arial" w:hAnsi="Arial" w:cs="Arial"/>
-          <w:b/>
-          <w:bCs/>
-          <w:sz w:val="22"/>
-          <w:szCs w:val="22"/>
-        </w:rPr>
-        <w:t>Debugging &amp; Testing</w:t>
-      </w:r>
     </w:p>
     <w:p>
       <w:pPr>
@@ -1210,28 +1003,6 @@
     </w:p>
     <w:p>
       <w:pPr>
-        <w:pStyle w:val="3"/>
-        <w:rPr>
-          <w:rFonts w:ascii="Arial" w:hAnsi="Arial" w:cs="Arial"/>
-          <w:color w:val="auto"/>
-          <w:sz w:val="22"/>
-          <w:szCs w:val="22"/>
-        </w:rPr>
-      </w:pPr>
-      <w:r>
-        <w:rPr>
-          <w:rStyle w:val="af1"/>
-          <w:rFonts w:ascii="Arial" w:hAnsi="Arial" w:cs="Arial"/>
-          <w:color w:val="auto"/>
-          <w:sz w:val="22"/>
-          <w:szCs w:val="22"/>
-        </w:rPr>
-        <w:lastRenderedPageBreak/>
-        <w:t>Game User Research</w:t>
-      </w:r>
-    </w:p>
-    <w:p>
-      <w:pPr>
         <w:numPr>
           <w:ilvl w:val="0"/>
           <w:numId w:val="6"/>
@@ -1264,27 +1035,6 @@
     </w:p>
     <w:p>
       <w:pPr>
-        <w:rPr>
-          <w:rFonts w:ascii="Arial" w:hAnsi="Arial" w:cs="Arial"/>
-          <w:b/>
-          <w:bCs/>
-          <w:sz w:val="22"/>
-          <w:szCs w:val="22"/>
-        </w:rPr>
-      </w:pPr>
-      <w:r>
-        <w:rPr>
-          <w:rFonts w:ascii="Arial" w:hAnsi="Arial" w:cs="Arial"/>
-          <w:b/>
-          <w:bCs/>
-          <w:sz w:val="22"/>
-          <w:szCs w:val="22"/>
-        </w:rPr>
-        <w:t>Inspiration &amp; Ideas</w:t>
-      </w:r>
-    </w:p>
-    <w:p>
-      <w:pPr>
         <w:numPr>
           <w:ilvl w:val="0"/>
           <w:numId w:val="7"/>
@@ -1402,46 +1152,6 @@
     </w:p>
     <w:p>
       <w:pPr>
-        <w:rPr>
-          <w:rFonts w:ascii="Arial" w:hAnsi="Arial" w:cs="Arial"/>
-          <w:sz w:val="22"/>
-          <w:szCs w:val="22"/>
-        </w:rPr>
-      </w:pPr>
-      <w:r>
-        <w:rPr>
-          <w:rFonts w:ascii="Arial" w:hAnsi="Arial" w:cs="Arial"/>
-          <w:sz w:val="22"/>
-          <w:szCs w:val="22"/>
-        </w:rPr>
-        <w:pict w14:anchorId="74E1AADF">
-          <v:rect id="_x0000_i1025" style="width:0;height:1.5pt" o:hralign="center" o:hrstd="t" o:hr="t" fillcolor="#a0a0a0" stroked="f"/>
-        </w:pict>
-      </w:r>
-    </w:p>
-    <w:p>
-      <w:pPr>
-        <w:rPr>
-          <w:rFonts w:ascii="Arial" w:hAnsi="Arial" w:cs="Arial"/>
-          <w:b/>
-          <w:bCs/>
-          <w:sz w:val="22"/>
-          <w:szCs w:val="22"/>
-        </w:rPr>
-      </w:pPr>
-      <w:r>
-        <w:rPr>
-          <w:rFonts w:ascii="Arial" w:hAnsi="Arial" w:cs="Arial"/>
-          <w:b/>
-          <w:bCs/>
-          <w:sz w:val="22"/>
-          <w:szCs w:val="22"/>
-        </w:rPr>
-        <w:t>Resources URL</w:t>
-      </w:r>
-    </w:p>
-    <w:p>
-      <w:pPr>
         <w:numPr>
           <w:ilvl w:val="0"/>
           <w:numId w:val="8"/>
@@ -1525,7 +1235,16 @@
           <w:sz w:val="22"/>
           <w:szCs w:val="22"/>
         </w:rPr>
-        <w:t xml:space="preserve"> - A fully functional Monopoly game in JavaScript, open-source on </w:t>
+        <w:t xml:space="preserve"> - A fully functional Monopoly game in </w:t>
+      </w:r>
+      <w:r>
+        <w:rPr>
+          <w:rFonts w:ascii="Arial" w:hAnsi="Arial" w:cs="Arial"/>
+          <w:sz w:val="22"/>
+          <w:szCs w:val="22"/>
+        </w:rPr>
+        <w:lastRenderedPageBreak/>
+        <w:t xml:space="preserve">JavaScript, open-source on </w:t>
       </w:r>
       <w:hyperlink r:id="rId51" w:history="1">
         <w:r>
@@ -1939,19 +1658,91 @@
     <w:p>
       <w:pPr>
         <w:rPr>
+          <w:rFonts w:ascii="Arial" w:hAnsi="Arial" w:cs="Arial"/>
+          <w:sz w:val="22"/>
+          <w:szCs w:val="22"/>
+        </w:rPr>
+      </w:pPr>
+      <w:hyperlink r:id="rId69" w:history="1">
+        <w:r>
+          <w:rPr>
+            <w:rStyle w:val="ae"/>
+            <w:rFonts w:ascii="Arial" w:hAnsi="Arial" w:cs="Arial"/>
+            <w:sz w:val="22"/>
+            <w:szCs w:val="22"/>
+          </w:rPr>
+          <w:t>https://pixabay.com/sound-effects/family-store-logo-13175/</w:t>
+        </w:r>
+      </w:hyperlink>
+    </w:p>
+    <w:p>
+      <w:pPr>
+        <w:rPr>
+          <w:rFonts w:ascii="Arial" w:hAnsi="Arial" w:cs="Arial"/>
+          <w:sz w:val="22"/>
+          <w:szCs w:val="22"/>
+        </w:rPr>
+      </w:pPr>
+      <w:hyperlink r:id="rId70" w:history="1">
+        <w:r>
+          <w:rPr>
+            <w:rStyle w:val="ae"/>
+            <w:rFonts w:ascii="Arial" w:hAnsi="Arial" w:cs="Arial"/>
+            <w:sz w:val="22"/>
+            <w:szCs w:val="22"/>
+          </w:rPr>
+          <w:t>https://github.com/marketplace/actions/bandit-scan</w:t>
+        </w:r>
+      </w:hyperlink>
+    </w:p>
+    <w:p>
+      <w:pPr>
+        <w:rPr>
+          <w:rFonts w:ascii="Arial" w:hAnsi="Arial" w:cs="Arial"/>
+          <w:sz w:val="22"/>
+          <w:szCs w:val="22"/>
+        </w:rPr>
+      </w:pPr>
+      <w:hyperlink r:id="rId71" w:history="1">
+        <w:r>
+          <w:rPr>
+            <w:rStyle w:val="ae"/>
+            <w:rFonts w:ascii="Arial" w:hAnsi="Arial" w:cs="Arial"/>
+            <w:sz w:val="22"/>
+            <w:szCs w:val="22"/>
+          </w:rPr>
+          <w:t>https://github.com/marketplace/actions/bandit-action</w:t>
+        </w:r>
+      </w:hyperlink>
+    </w:p>
+    <w:p>
+      <w:pPr>
+        <w:rPr>
+          <w:rFonts w:ascii="Arial" w:hAnsi="Arial" w:cs="Arial"/>
+          <w:sz w:val="22"/>
+          <w:szCs w:val="22"/>
+        </w:rPr>
+      </w:pPr>
+      <w:hyperlink r:id="rId72" w:history="1">
+        <w:r>
+          <w:rPr>
+            <w:rStyle w:val="ae"/>
+            <w:rFonts w:ascii="Arial" w:hAnsi="Arial" w:cs="Arial"/>
+            <w:sz w:val="22"/>
+            <w:szCs w:val="22"/>
+          </w:rPr>
+          <w:t>https://marketplace.visualstudio.com/items/?itemName=MS-SarifVSCode.sarif-viewer</w:t>
+        </w:r>
+      </w:hyperlink>
+    </w:p>
+    <w:p>
+      <w:pPr>
+        <w:rPr>
           <w:rFonts w:ascii="Arial" w:hAnsi="Arial" w:cs="Arial" w:hint="eastAsia"/>
           <w:sz w:val="22"/>
           <w:szCs w:val="22"/>
         </w:rPr>
       </w:pPr>
-      <w:r>
-        <w:rPr>
-          <w:rFonts w:ascii="Arial" w:hAnsi="Arial" w:cs="Arial"/>
-          <w:sz w:val="22"/>
-          <w:szCs w:val="22"/>
-        </w:rPr>
-        <w:t>https://pixabay.com/sound-effects/family-store-logo-13175/</w:t>
-      </w:r>
     </w:p>
     <w:sectPr>
       <w:pgSz w:w="11906" w:h="16838"/>

</xml_diff>